<commit_message>
fix: update leader to Duong Gia Phat (3124411212) across report, readme, and packaging
</commit_message>
<xml_diff>
--- a/Lab05_ThucHanhBaiToanPhanLop/Bao_Cao_Tong_Hop_Lab05_Phan_Lop.docx
+++ b/Lab05_ThucHanhBaiToanPhanLop/Bao_Cao_Tong_Hop_Lab05_Phan_Lop.docx
@@ -183,7 +183,7 @@
                 <w:rFonts w:ascii="Times New Roman" w:hAnsi="Times New Roman"/>
                 <w:sz w:val="20"/>
               </w:rPr>
-              <w:t>Lê Văn Hiếu</w:t>
+              <w:t>Dương Gia Phát</w:t>
             </w:r>
           </w:p>
         </w:tc>
@@ -213,7 +213,7 @@
                 <w:rFonts w:ascii="Times New Roman" w:hAnsi="Times New Roman"/>
                 <w:sz w:val="20"/>
               </w:rPr>
-              <w:t>3124411091</w:t>
+              <w:t>3124411212</w:t>
             </w:r>
           </w:p>
         </w:tc>
@@ -367,7 +367,7 @@
                 <w:rFonts w:ascii="Times New Roman" w:hAnsi="Times New Roman"/>
                 <w:sz w:val="20"/>
               </w:rPr>
-              <w:t>Dương Gia Phát</w:t>
+              <w:t>Lê Văn Hiếu</w:t>
             </w:r>
           </w:p>
         </w:tc>
@@ -397,7 +397,7 @@
                 <w:rFonts w:ascii="Times New Roman" w:hAnsi="Times New Roman"/>
                 <w:sz w:val="20"/>
               </w:rPr>
-              <w:t>3124411212</w:t>
+              <w:t>3124411091</w:t>
             </w:r>
           </w:p>
         </w:tc>

</xml_diff>

<commit_message>
docs: align exact task allocation table with Google Sheet plan
</commit_message>
<xml_diff>
--- a/Lab05_ThucHanhBaiToanPhanLop/Bao_Cao_Tong_Hop_Lab05_Phan_Lop.docx
+++ b/Lab05_ThucHanhBaiToanPhanLop/Bao_Cao_Tong_Hop_Lab05_Phan_Lop.docx
@@ -243,7 +243,99 @@
                 <w:rFonts w:ascii="Times New Roman" w:hAnsi="Times New Roman"/>
                 <w:sz w:val="20"/>
               </w:rPr>
-              <w:t>Nhóm trưởng - Phụ trách Mục 2.1 Cây quyết định và Rừng ngẫu nhiên, tổng hợp báo cáo</w:t>
+              <w:t>Nhóm trưởng - Phụ trách Mục 2.1 Cây quyết định &amp; Rừng ngẫu nhiên, hoàn thiện báo cáo</w:t>
+            </w:r>
+          </w:p>
+        </w:tc>
+      </w:tr>
+      <w:tr>
+        <w:tc>
+          <w:tcPr>
+            <w:tcW w:type="dxa" w:w="2304"/>
+            <w:tcMar>
+              <w:top w:w="80" w:type="dxa"/>
+              <w:bottom w:w="80" w:type="dxa"/>
+              <w:left w:w="100" w:type="dxa"/>
+              <w:right w:w="100" w:type="dxa"/>
+            </w:tcMar>
+            <w:tcBorders>
+              <w:top w:val="none"/>
+              <w:bottom w:val="none"/>
+              <w:left w:val="none"/>
+              <w:right w:val="none"/>
+            </w:tcBorders>
+          </w:tcPr>
+          <w:p>
+            <w:pPr>
+              <w:spacing w:before="60" w:after="60"/>
+              <w:jc w:val="left"/>
+            </w:pPr>
+            <w:r>
+              <w:rPr>
+                <w:rFonts w:ascii="Times New Roman" w:hAnsi="Times New Roman"/>
+                <w:sz w:val="20"/>
+              </w:rPr>
+              <w:t>Lê Văn Hiếu</w:t>
+            </w:r>
+          </w:p>
+        </w:tc>
+        <w:tc>
+          <w:tcPr>
+            <w:tcW w:type="dxa" w:w="1728"/>
+            <w:tcMar>
+              <w:top w:w="80" w:type="dxa"/>
+              <w:bottom w:w="80" w:type="dxa"/>
+              <w:left w:w="100" w:type="dxa"/>
+              <w:right w:w="100" w:type="dxa"/>
+            </w:tcMar>
+            <w:tcBorders>
+              <w:top w:val="none"/>
+              <w:bottom w:val="none"/>
+              <w:left w:val="none"/>
+              <w:right w:val="none"/>
+            </w:tcBorders>
+          </w:tcPr>
+          <w:p>
+            <w:pPr>
+              <w:spacing w:before="60" w:after="60"/>
+              <w:jc w:val="center"/>
+            </w:pPr>
+            <w:r>
+              <w:rPr>
+                <w:rFonts w:ascii="Times New Roman" w:hAnsi="Times New Roman"/>
+                <w:sz w:val="20"/>
+              </w:rPr>
+              <w:t>3124411091</w:t>
+            </w:r>
+          </w:p>
+        </w:tc>
+        <w:tc>
+          <w:tcPr>
+            <w:tcW w:type="dxa" w:w="5472"/>
+            <w:tcMar>
+              <w:top w:w="80" w:type="dxa"/>
+              <w:bottom w:w="80" w:type="dxa"/>
+              <w:left w:w="100" w:type="dxa"/>
+              <w:right w:w="100" w:type="dxa"/>
+            </w:tcMar>
+            <w:tcBorders>
+              <w:top w:val="none"/>
+              <w:bottom w:val="none"/>
+              <w:left w:val="none"/>
+              <w:right w:val="none"/>
+            </w:tcBorders>
+          </w:tcPr>
+          <w:p>
+            <w:pPr>
+              <w:spacing w:before="60" w:after="60"/>
+              <w:jc w:val="center"/>
+            </w:pPr>
+            <w:r>
+              <w:rPr>
+                <w:rFonts w:ascii="Times New Roman" w:hAnsi="Times New Roman"/>
+                <w:sz w:val="20"/>
+              </w:rPr>
+              <w:t>Thành viên - Phụ trách Mục 1.1 Thống kê mô tả và Mục 1.2 Xử lý &amp; Trực quan hóa dữ liệu</w:t>
             </w:r>
           </w:p>
         </w:tc>
@@ -335,99 +427,7 @@
                 <w:rFonts w:ascii="Times New Roman" w:hAnsi="Times New Roman"/>
                 <w:sz w:val="20"/>
               </w:rPr>
-              <w:t>Thành viên - Phụ trách Mục 2.2 Support Vector Machine</w:t>
-            </w:r>
-          </w:p>
-        </w:tc>
-      </w:tr>
-      <w:tr>
-        <w:tc>
-          <w:tcPr>
-            <w:tcW w:type="dxa" w:w="2304"/>
-            <w:tcMar>
-              <w:top w:w="80" w:type="dxa"/>
-              <w:bottom w:w="80" w:type="dxa"/>
-              <w:left w:w="100" w:type="dxa"/>
-              <w:right w:w="100" w:type="dxa"/>
-            </w:tcMar>
-            <w:tcBorders>
-              <w:top w:val="none"/>
-              <w:bottom w:val="none"/>
-              <w:left w:val="none"/>
-              <w:right w:val="none"/>
-            </w:tcBorders>
-          </w:tcPr>
-          <w:p>
-            <w:pPr>
-              <w:spacing w:before="60" w:after="60"/>
-              <w:jc w:val="left"/>
-            </w:pPr>
-            <w:r>
-              <w:rPr>
-                <w:rFonts w:ascii="Times New Roman" w:hAnsi="Times New Roman"/>
-                <w:sz w:val="20"/>
-              </w:rPr>
-              <w:t>Lê Văn Hiếu</w:t>
-            </w:r>
-          </w:p>
-        </w:tc>
-        <w:tc>
-          <w:tcPr>
-            <w:tcW w:type="dxa" w:w="1728"/>
-            <w:tcMar>
-              <w:top w:w="80" w:type="dxa"/>
-              <w:bottom w:w="80" w:type="dxa"/>
-              <w:left w:w="100" w:type="dxa"/>
-              <w:right w:w="100" w:type="dxa"/>
-            </w:tcMar>
-            <w:tcBorders>
-              <w:top w:val="none"/>
-              <w:bottom w:val="none"/>
-              <w:left w:val="none"/>
-              <w:right w:val="none"/>
-            </w:tcBorders>
-          </w:tcPr>
-          <w:p>
-            <w:pPr>
-              <w:spacing w:before="60" w:after="60"/>
-              <w:jc w:val="center"/>
-            </w:pPr>
-            <w:r>
-              <w:rPr>
-                <w:rFonts w:ascii="Times New Roman" w:hAnsi="Times New Roman"/>
-                <w:sz w:val="20"/>
-              </w:rPr>
-              <w:t>3124411091</w:t>
-            </w:r>
-          </w:p>
-        </w:tc>
-        <w:tc>
-          <w:tcPr>
-            <w:tcW w:type="dxa" w:w="5472"/>
-            <w:tcMar>
-              <w:top w:w="80" w:type="dxa"/>
-              <w:bottom w:w="80" w:type="dxa"/>
-              <w:left w:w="100" w:type="dxa"/>
-              <w:right w:w="100" w:type="dxa"/>
-            </w:tcMar>
-            <w:tcBorders>
-              <w:top w:val="none"/>
-              <w:bottom w:val="none"/>
-              <w:left w:val="none"/>
-              <w:right w:val="none"/>
-            </w:tcBorders>
-          </w:tcPr>
-          <w:p>
-            <w:pPr>
-              <w:spacing w:before="60" w:after="60"/>
-              <w:jc w:val="center"/>
-            </w:pPr>
-            <w:r>
-              <w:rPr>
-                <w:rFonts w:ascii="Times New Roman" w:hAnsi="Times New Roman"/>
-                <w:sz w:val="20"/>
-              </w:rPr>
-              <w:t>Thành viên - Phụ trách Mục 2.3 Naive Bayes</w:t>
+              <w:t>Thành viên - Phụ trách Mục 1.3 Đơn biến &amp; Hai biến và Mục 2.3 Bayes ngây thơ</w:t>
             </w:r>
           </w:p>
         </w:tc>
@@ -519,7 +519,7 @@
                 <w:rFonts w:ascii="Times New Roman" w:hAnsi="Times New Roman"/>
                 <w:sz w:val="20"/>
               </w:rPr>
-              <w:t>Thành viên - Phụ trách Phần 1 Khám phá dữ liệu EDA</w:t>
+              <w:t>Thành viên - Phụ trách Mục 2.2 Support Vector Machine và Quản lý Dataset</w:t>
             </w:r>
           </w:p>
         </w:tc>

</xml_diff>